<commit_message>
feat: prototipo 3 — Pueblo_01 con casas, arboles, NPC, cofre y salida
- pueblo_01.tscn: mapa completo con suelo, 3 casas, 6 arboles, 2 NPCs, cofre y zona de salida
- house.tscn / tree.tscn / chest.tscn: escenas reutilizables con colisiones
- camera_follow.gd: camara ortografica que sigue al jugador suavemente
- exit_zone.gd: zona de salida con cambio de escena o mensaje placeholder
- chest.gd: cofre interactuable con animacion de tapa y dialogo
- player.gd: añade grupo "player" para que la camara lo encuentre
- WorldEnvironment con niebla y luz ambiental azulada

Co-Authored-By: Claude Sonnet 4.6 <noreply@anthropic.com>
</commit_message>
<xml_diff>
--- a/documentacion/Artifice_rpg_game.docx
+++ b/documentacion/Artifice_rpg_game.docx
@@ -78,7 +78,113 @@
         <w:rPr>
           <w:lang w:val="es-MX"/>
         </w:rPr>
-        <w:t xml:space="preserve"> en diseño </w:t>
+        <w:t xml:space="preserve"> en diseño</w:t>
+      </w:r>
+      <w:r>
+        <w:rPr>
+          <w:lang w:val="es-MX"/>
+        </w:rPr>
+        <w:t>.</w:t>
+      </w:r>
+      <w:r>
+        <w:rPr>
+          <w:lang w:val="es-MX"/>
+        </w:rPr>
+        <w:br/>
+      </w:r>
+      <w:r>
+        <w:rPr>
+          <w:lang w:val="es-MX"/>
+        </w:rPr>
+        <w:br/>
+        <w:t xml:space="preserve">Un </w:t>
+      </w:r>
+      <w:proofErr w:type="spellStart"/>
+      <w:r>
+        <w:rPr>
+          <w:lang w:val="es-MX"/>
+        </w:rPr>
+        <w:t>rpg</w:t>
+      </w:r>
+      <w:proofErr w:type="spellEnd"/>
+      <w:r>
+        <w:rPr>
+          <w:lang w:val="es-MX"/>
+        </w:rPr>
+        <w:t xml:space="preserve"> de combate con turnos subida de nivel, clases de los personajes y si es posible personalización del jugador</w:t>
+      </w:r>
+      <w:r>
+        <w:rPr>
+          <w:lang w:val="es-MX"/>
+        </w:rPr>
+        <w:t>, ropa armas etc.</w:t>
+      </w:r>
+      <w:r>
+        <w:rPr>
+          <w:lang w:val="es-MX"/>
+        </w:rPr>
+        <w:br/>
+      </w:r>
+      <w:r>
+        <w:rPr>
+          <w:lang w:val="es-MX"/>
+        </w:rPr>
+        <w:br/>
+        <w:t xml:space="preserve">mundo estilo medieval fantástico, con distintas razas Elfos, monstruos, humanos, personas bestias, los clásicos en cualquier </w:t>
+      </w:r>
+      <w:proofErr w:type="spellStart"/>
+      <w:r>
+        <w:rPr>
+          <w:lang w:val="es-MX"/>
+        </w:rPr>
+        <w:t>rpg</w:t>
+      </w:r>
+      <w:proofErr w:type="spellEnd"/>
+      <w:r>
+        <w:rPr>
+          <w:lang w:val="es-MX"/>
+        </w:rPr>
+        <w:t xml:space="preserve"> de fantasía que se respete.</w:t>
+      </w:r>
+      <w:r>
+        <w:rPr>
+          <w:lang w:val="es-MX"/>
+        </w:rPr>
+        <w:br/>
+      </w:r>
+      <w:r>
+        <w:rPr>
+          <w:lang w:val="es-MX"/>
+        </w:rPr>
+        <w:br/>
+        <w:t>primer acto: Inicio</w:t>
+      </w:r>
+    </w:p>
+    <w:p>
+      <w:pPr>
+        <w:rPr>
+          <w:lang w:val="es-MX"/>
+        </w:rPr>
+      </w:pPr>
+      <w:r>
+        <w:rPr>
+          <w:lang w:val="es-MX"/>
+        </w:rPr>
+        <w:t xml:space="preserve">La primera escena del juego comienza con una cinemática de una guerra entre las distintas razas del reino (más adelante se revela el motivo de la guerra) esta el rey humano frente al rey de los monstruos ambos mal heridos teniendo un dialogo, aparece una persona en escena que vendría a ser el </w:t>
+      </w:r>
+      <w:proofErr w:type="spellStart"/>
+      <w:r>
+        <w:rPr>
+          <w:lang w:val="es-MX"/>
+        </w:rPr>
+        <w:t>artifice</w:t>
+      </w:r>
+      <w:proofErr w:type="spellEnd"/>
+      <w:r>
+        <w:rPr>
+          <w:lang w:val="es-MX"/>
+        </w:rPr>
+        <w:t xml:space="preserve"> y dice basta y se difumina en blanco pasando a la escena donde el protagonista despierta todo era un sueño, ya que lo que vio había pasado 50 años en el pasado. La idea es que aquí el jugador pueda seleccionar el nombre del personaje donde se le llamara el resto de la aventura, entorno una granja casa de dos pisos tres piezas 1 baño living comedor cocina, exterior cosechas arboles rejas de madera.</w:t>
       </w:r>
     </w:p>
     <w:sectPr>

</xml_diff>